<commit_message>
docs: apply original report template formatting
</commit_message>
<xml_diff>
--- a/SoftwareEngineering/generated/宿舍报修管理系统软件工程导论期末考查报告.docx
+++ b/SoftwareEngineering/generated/宿舍报修管理系统软件工程导论期末考查报告.docx
@@ -3,37 +3,53 @@
 <w:document xmlns:wpc="http://schemas.microsoft.com/office/word/2010/wordprocessingCanvas" xmlns:mo="http://schemas.microsoft.com/office/mac/office/2008/main" xmlns:mc="http://schemas.openxmlformats.org/markup-compatibility/2006" xmlns:mv="urn:schemas-microsoft-com:mac:vml" xmlns:o="urn:schemas-microsoft-com:office:office" xmlns:r="http://schemas.openxmlformats.org/officeDocument/2006/relationships" xmlns:m="http://schemas.openxmlformats.org/officeDocument/2006/math" xmlns:v="urn:schemas-microsoft-com:vml" xmlns:wp14="http://schemas.microsoft.com/office/word/2010/wordprocessingDrawing" xmlns:wp="http://schemas.openxmlformats.org/drawingml/2006/wordprocessingDrawing" xmlns:w10="urn:schemas-microsoft-com:office:word" xmlns:w="http://schemas.openxmlformats.org/wordprocessingml/2006/main" xmlns:w14="http://schemas.microsoft.com/office/word/2010/wordml" xmlns:wpg="http://schemas.microsoft.com/office/word/2010/wordprocessingGroup" xmlns:wpi="http://schemas.microsoft.com/office/word/2010/wordprocessingInk" xmlns:wne="http://schemas.microsoft.com/office/word/2006/wordml" xmlns:wps="http://schemas.microsoft.com/office/word/2010/wordprocessingShape" mc:Ignorable="w14 wp14">
   <w:body>
     <w:p/>
+    <w:p>
+      <w:pPr>
+        <w:spacing w:after="160"/>
+        <w:jc w:val="center"/>
+      </w:pPr>
+      <w:r>
+        <w:rPr>
+          <w:rFonts w:ascii="Times New Roman" w:hAnsi="Times New Roman" w:eastAsia="Times New Roman"/>
+          <w:b w:val="0"/>
+          <w:sz w:val="28"/>
+        </w:rPr>
+        <w:t>Sichuan Top Vocational College of Information Technology</w:t>
+      </w:r>
+    </w:p>
+    <w:p/>
     <w:p/>
     <w:p>
       <w:pPr>
+        <w:spacing w:after="360"/>
         <w:jc w:val="center"/>
       </w:pPr>
       <w:r>
         <w:rPr>
           <w:rFonts w:ascii="黑体" w:hAnsi="黑体" w:eastAsia="黑体"/>
           <w:b/>
-          <w:sz w:val="48"/>
+          <w:sz w:val="52"/>
         </w:rPr>
-        <w:t>《软件工程导论》期末考查报告</w:t>
+        <w:t>期  末  考  查  报  告</w:t>
       </w:r>
     </w:p>
     <w:p>
       <w:pPr>
+        <w:spacing w:after="600"/>
         <w:jc w:val="center"/>
       </w:pPr>
       <w:r>
         <w:rPr>
-          <w:rFonts w:ascii="黑体" w:hAnsi="黑体" w:eastAsia="黑体"/>
+          <w:rFonts w:ascii="宋体" w:hAnsi="宋体" w:eastAsia="宋体"/>
+          <w:b w:val="0"/>
           <w:sz w:val="36"/>
         </w:rPr>
-        <w:t>题目：宿舍报修管理系统分析与设计</w:t>
+        <w:t>（《软件工程导论》）</w:t>
       </w:r>
     </w:p>
-    <w:p/>
-    <w:p/>
-    <w:p/>
     <w:p>
       <w:pPr>
+        <w:spacing w:line="432" w:lineRule="auto"/>
         <w:jc w:val="center"/>
       </w:pPr>
       <w:r>
@@ -41,11 +57,12 @@
           <w:rFonts w:ascii="宋体" w:hAnsi="宋体" w:eastAsia="宋体"/>
           <w:sz w:val="32"/>
         </w:rPr>
-        <w:t>学    院：________________________</w:t>
+        <w:t>姓    名： ______________________</w:t>
       </w:r>
     </w:p>
     <w:p>
       <w:pPr>
+        <w:spacing w:line="432" w:lineRule="auto"/>
         <w:jc w:val="center"/>
       </w:pPr>
       <w:r>
@@ -53,11 +70,12 @@
           <w:rFonts w:ascii="宋体" w:hAnsi="宋体" w:eastAsia="宋体"/>
           <w:sz w:val="32"/>
         </w:rPr>
-        <w:t>专    业：________________________</w:t>
+        <w:t>学    号： ______________________</w:t>
       </w:r>
     </w:p>
     <w:p>
       <w:pPr>
+        <w:spacing w:line="432" w:lineRule="auto"/>
         <w:jc w:val="center"/>
       </w:pPr>
       <w:r>
@@ -65,11 +83,12 @@
           <w:rFonts w:ascii="宋体" w:hAnsi="宋体" w:eastAsia="宋体"/>
           <w:sz w:val="32"/>
         </w:rPr>
-        <w:t>班    级：________________________</w:t>
+        <w:t>系    别： _信息工程学院_</w:t>
       </w:r>
     </w:p>
     <w:p>
       <w:pPr>
+        <w:spacing w:line="432" w:lineRule="auto"/>
         <w:jc w:val="center"/>
       </w:pPr>
       <w:r>
@@ -77,11 +96,12 @@
           <w:rFonts w:ascii="宋体" w:hAnsi="宋体" w:eastAsia="宋体"/>
           <w:sz w:val="32"/>
         </w:rPr>
-        <w:t>姓    名：________________________</w:t>
+        <w:t>专    业： _软件技术_    _</w:t>
       </w:r>
     </w:p>
     <w:p>
       <w:pPr>
+        <w:spacing w:line="432" w:lineRule="auto"/>
         <w:jc w:val="center"/>
       </w:pPr>
       <w:r>
@@ -89,11 +109,12 @@
           <w:rFonts w:ascii="宋体" w:hAnsi="宋体" w:eastAsia="宋体"/>
           <w:sz w:val="32"/>
         </w:rPr>
-        <w:t>学    号：________________________</w:t>
+        <w:t>年    级： ___2024级_____</w:t>
       </w:r>
     </w:p>
     <w:p>
       <w:pPr>
+        <w:spacing w:line="432" w:lineRule="auto"/>
         <w:jc w:val="center"/>
       </w:pPr>
       <w:r>
@@ -101,11 +122,12 @@
           <w:rFonts w:ascii="宋体" w:hAnsi="宋体" w:eastAsia="宋体"/>
           <w:sz w:val="32"/>
         </w:rPr>
-        <w:t>指导教师：________________________</w:t>
+        <w:t>班    级： ___ ___________</w:t>
       </w:r>
     </w:p>
     <w:p>
       <w:pPr>
+        <w:spacing w:line="432" w:lineRule="auto"/>
         <w:jc w:val="center"/>
       </w:pPr>
       <w:r>
@@ -113,12 +135,185 @@
           <w:rFonts w:ascii="宋体" w:hAnsi="宋体" w:eastAsia="宋体"/>
           <w:sz w:val="32"/>
         </w:rPr>
-        <w:t>完成日期：2026 年 ____ 月 ____ 日</w:t>
+        <w:t>指导教师： ___项叙淋_ ____</w:t>
+      </w:r>
+    </w:p>
+    <w:p/>
+    <w:p/>
+    <w:p>
+      <w:pPr>
+        <w:spacing w:after="0"/>
+        <w:jc w:val="center"/>
+      </w:pPr>
+      <w:r>
+        <w:rPr>
+          <w:rFonts w:ascii="宋体" w:hAnsi="宋体" w:eastAsia="宋体"/>
+          <w:b w:val="0"/>
+          <w:sz w:val="28"/>
+        </w:rPr>
+        <w:t>2026 年    月    日 至   2026 年   月   日</w:t>
+      </w:r>
+    </w:p>
+    <w:p>
+      <w:pPr>
+        <w:spacing w:after="0"/>
+        <w:jc w:val="center"/>
+      </w:pPr>
+      <w:r>
+        <w:rPr>
+          <w:rFonts w:ascii="宋体" w:hAnsi="宋体" w:eastAsia="宋体"/>
+          <w:b w:val="0"/>
+          <w:sz w:val="24"/>
+        </w:rPr>
+        <w:t>所 在 单 位 ：  __         _级    系    专业    班</w:t>
       </w:r>
     </w:p>
     <w:p>
       <w:r>
         <w:br w:type="page"/>
+      </w:r>
+    </w:p>
+    <w:p>
+      <w:pPr>
+        <w:spacing w:before="160" w:after="80"/>
+      </w:pPr>
+      <w:r>
+        <w:rPr>
+          <w:rFonts w:ascii="黑体" w:hAnsi="黑体" w:eastAsia="黑体"/>
+          <w:b/>
+          <w:sz w:val="28"/>
+        </w:rPr>
+        <w:t>项目名称：</w:t>
+      </w:r>
+    </w:p>
+    <w:p>
+      <w:pPr>
+        <w:spacing w:line="360" w:lineRule="auto"/>
+      </w:pPr>
+      <w:r>
+        <w:rPr>
+          <w:rFonts w:ascii="宋体" w:hAnsi="宋体" w:eastAsia="宋体"/>
+          <w:b w:val="0"/>
+          <w:sz w:val="24"/>
+        </w:rPr>
+        <w:t>宿舍报修管理系统分析与设计</w:t>
+      </w:r>
+    </w:p>
+    <w:p>
+      <w:pPr>
+        <w:spacing w:before="160" w:after="80"/>
+      </w:pPr>
+      <w:r>
+        <w:rPr>
+          <w:rFonts w:ascii="黑体" w:hAnsi="黑体" w:eastAsia="黑体"/>
+          <w:b/>
+          <w:sz w:val="28"/>
+        </w:rPr>
+        <w:t>项目目的：</w:t>
+      </w:r>
+    </w:p>
+    <w:p>
+      <w:pPr>
+        <w:spacing w:line="360" w:lineRule="auto"/>
+      </w:pPr>
+      <w:r>
+        <w:rPr>
+          <w:rFonts w:ascii="宋体" w:hAnsi="宋体" w:eastAsia="宋体"/>
+          <w:b w:val="0"/>
+          <w:sz w:val="24"/>
+        </w:rPr>
+        <w:t>1、巩固软件工程核心知识点：将课堂所学的需求分析、总体设计、详细设计、编码、测试等理论知识，转化为实际操作，熟练掌握 DFD、UML 图（类图、状态图、用例图）、系统结构图、详细设计图形（流程图 / 盒图 / PAD 图）等工具的使用。</w:t>
+      </w:r>
+    </w:p>
+    <w:p>
+      <w:pPr>
+        <w:spacing w:line="360" w:lineRule="auto"/>
+      </w:pPr>
+      <w:r>
+        <w:rPr>
+          <w:rFonts w:ascii="宋体" w:hAnsi="宋体" w:eastAsia="宋体"/>
+          <w:b w:val="0"/>
+          <w:sz w:val="24"/>
+        </w:rPr>
+        <w:t>2、培养完整的软件设计思维：学会从需求出发，逐步推进系统设计、编码与测试，理解各阶段的衔接逻辑，建立“需求—设计—编码—测试”的完整闭环思维，避免设计与实现脱节。</w:t>
+      </w:r>
+    </w:p>
+    <w:p>
+      <w:pPr>
+        <w:spacing w:line="360" w:lineRule="auto"/>
+      </w:pPr>
+      <w:r>
+        <w:rPr>
+          <w:rFonts w:ascii="宋体" w:hAnsi="宋体" w:eastAsia="宋体"/>
+          <w:b w:val="0"/>
+          <w:sz w:val="24"/>
+        </w:rPr>
+        <w:t>3、提升实操与问题解决能力：通过自选系统、完成各环节设计与编码，锻炼模块划分、逻辑梳理、测试用例设计的实操能力，学会解决设计过程中出现的图形规范、逻辑矛盾等实际问题。</w:t>
+      </w:r>
+    </w:p>
+    <w:p>
+      <w:pPr>
+        <w:spacing w:before="160" w:after="80"/>
+      </w:pPr>
+      <w:r>
+        <w:rPr>
+          <w:rFonts w:ascii="黑体" w:hAnsi="黑体" w:eastAsia="黑体"/>
+          <w:b/>
+          <w:sz w:val="28"/>
+        </w:rPr>
+        <w:t>项目内容及要求：</w:t>
+      </w:r>
+    </w:p>
+    <w:p>
+      <w:pPr>
+        <w:spacing w:line="360" w:lineRule="auto"/>
+      </w:pPr>
+      <w:r>
+        <w:rPr>
+          <w:rFonts w:ascii="宋体" w:hAnsi="宋体" w:eastAsia="宋体"/>
+          <w:b/>
+          <w:sz w:val="24"/>
+        </w:rPr>
+        <w:t>说明：</w:t>
+      </w:r>
+    </w:p>
+    <w:p>
+      <w:pPr>
+        <w:spacing w:line="360" w:lineRule="auto"/>
+      </w:pPr>
+      <w:r>
+        <w:rPr>
+          <w:rFonts w:ascii="宋体" w:hAnsi="宋体" w:eastAsia="宋体"/>
+          <w:b w:val="0"/>
+          <w:sz w:val="24"/>
+        </w:rPr>
+        <w:t>1、自选系统限定为中小型事务管理信息系统，从以下四类中选择其一：图书借阅系统、学生教务管理系统、超市订单管理系统、宿舍报修管理系统，禁止自定义其他简单系统。</w:t>
+      </w:r>
+    </w:p>
+    <w:p>
+      <w:pPr>
+        <w:spacing w:line="360" w:lineRule="auto"/>
+      </w:pPr>
+      <w:r>
+        <w:rPr>
+          <w:rFonts w:ascii="宋体" w:hAnsi="宋体" w:eastAsia="宋体"/>
+          <w:b w:val="0"/>
+          <w:sz w:val="24"/>
+        </w:rPr>
+        <w:t>2、所有图形（E-R图、类图、DFD、状态图、系统结构图、流程图/盒图/PAD图、用例图）需符合软件工程绘图规范，标注清晰、逻辑严谨。</w:t>
+      </w:r>
+    </w:p>
+    <w:p>
+      <w:pPr>
+        <w:spacing w:line="360" w:lineRule="auto"/>
+      </w:pPr>
+      <w:r>
+        <w:rPr>
+          <w:rFonts w:ascii="宋体" w:hAnsi="宋体" w:eastAsia="宋体"/>
+          <w:b w:val="0"/>
+          <w:sz w:val="24"/>
+        </w:rPr>
+        <w:t>3、所有设计内容需前后一致，编码、测试需对应前面设计的模块/功能，不得脱节。</w:t>
       </w:r>
     </w:p>
     <w:p>
@@ -137,6 +332,7 @@
       <w:r>
         <w:rPr>
           <w:rFonts w:ascii="宋体" w:hAnsi="宋体" w:eastAsia="宋体"/>
+          <w:b w:val="0"/>
           <w:sz w:val="24"/>
         </w:rPr>
         <w:t>本报告选择“宿舍报修管理系统”作为分析与设计对象。该系统面向高校宿舍日常维修管理场景，主要解决学生报修渠道分散、维修派工不透明、处理进度难以追踪、后勤统计依赖人工整理等问题。系统的核心业务围绕“学生提交报修—管理员审核—维修员处理—学生确认评价—后勤统计分析”展开，是典型的中小型事务管理信息系统。</w:t>
@@ -150,6 +346,7 @@
       <w:r>
         <w:rPr>
           <w:rFonts w:ascii="宋体" w:hAnsi="宋体" w:eastAsia="宋体"/>
+          <w:b w:val="0"/>
           <w:sz w:val="24"/>
         </w:rPr>
         <w:t>系统采用增量模型进行开发。宿舍报修业务需求相对清晰，但在实际运行中可能逐步增加移动端提醒、维修材料管理、满意度统计等功能。增量模型可以先完成报修、审核、派工、反馈这一主流程，再逐步扩展统计分析、评价管理和基础数据维护等功能。与瀑布模型相比，增量模型便于分阶段交付和根据师生反馈调整；与螺旋模型相比，本系统规模较小、风险较低，不需要投入过高的风险分析成本。</w:t>
@@ -163,6 +360,7 @@
       <w:r>
         <w:rPr>
           <w:rFonts w:ascii="宋体" w:hAnsi="宋体" w:eastAsia="宋体"/>
+          <w:b w:val="0"/>
           <w:sz w:val="24"/>
         </w:rPr>
         <w:t>系统核心功能包括：1）报修申请管理：学生填写宿舍号、故障类型、故障描述和附件后提交报修申请，系统校验学生与宿舍档案并生成工单；2）工单审核与派工：管理员审核报修信息，判断是否受理，并根据故障类型、紧急程度和维修员负载进行派工；3）维修处理与反馈：维修员接收派工任务，到场处理后填写维修结果，学生确认后关闭工单；4）统计查询：管理员和后勤部门按照工单状态、故障类型、楼栋宿舍和维修时长查询并导出统计结果。</w:t>
@@ -176,6 +374,7 @@
       <w:r>
         <w:rPr>
           <w:rFonts w:ascii="宋体" w:hAnsi="宋体" w:eastAsia="宋体"/>
+          <w:b w:val="0"/>
           <w:sz w:val="24"/>
         </w:rPr>
         <w:t>参与者包括学生、宿管或管理员、维修员和后勤管理部门。主要数据对象包括学生、宿舍、报修工单、派工记录、维修员和管理员。核心业务实体为“报修工单”，其状态变化贯穿系统主流程。</w:t>
@@ -197,6 +396,7 @@
       <w:r>
         <w:rPr>
           <w:rFonts w:ascii="宋体" w:hAnsi="宋体" w:eastAsia="宋体"/>
+          <w:b w:val="0"/>
           <w:sz w:val="24"/>
         </w:rPr>
         <w:t>本报告选择绘制 UML 类图。类图包含学生、宿舍、报修工单、维修员、管理员、派工记录六个主要类，能够体现系统的静态结构。</w:t>
@@ -222,7 +422,7 @@
                     <pic:cNvPicPr/>
                   </pic:nvPicPr>
                   <pic:blipFill>
-                    <a:blip r:embed="rId9"/>
+                    <a:blip r:embed="rId10"/>
                     <a:stretch>
                       <a:fillRect/>
                     </a:stretch>
@@ -269,6 +469,7 @@
       <w:r>
         <w:rPr>
           <w:rFonts w:ascii="宋体" w:hAnsi="宋体" w:eastAsia="宋体"/>
+          <w:b w:val="0"/>
           <w:sz w:val="24"/>
         </w:rPr>
         <w:t>顶层 DFD 将整个系统抽象为一个加工 P0，外部实体包括学生、管理员、维修员和后勤管理部门。</w:t>
@@ -294,7 +495,7 @@
                     <pic:cNvPicPr/>
                   </pic:nvPicPr>
                   <pic:blipFill>
-                    <a:blip r:embed="rId10"/>
+                    <a:blip r:embed="rId11"/>
                     <a:stretch>
                       <a:fillRect/>
                     </a:stretch>
@@ -333,6 +534,7 @@
       <w:r>
         <w:rPr>
           <w:rFonts w:ascii="宋体" w:hAnsi="宋体" w:eastAsia="宋体"/>
+          <w:b w:val="0"/>
           <w:sz w:val="24"/>
         </w:rPr>
         <w:t>0 层 DFD 将 P0 分解为报修申请受理、工单审核、派工处理、维修反馈确认、统计查询五个加工，并设置学生/宿舍档案、报修工单库、派工/维修记录三个数据存储。</w:t>
@@ -358,7 +560,7 @@
                     <pic:cNvPicPr/>
                   </pic:nvPicPr>
                   <pic:blipFill>
-                    <a:blip r:embed="rId11"/>
+                    <a:blip r:embed="rId12"/>
                     <a:stretch>
                       <a:fillRect/>
                     </a:stretch>
@@ -405,6 +607,7 @@
       <w:r>
         <w:rPr>
           <w:rFonts w:ascii="宋体" w:hAnsi="宋体" w:eastAsia="宋体"/>
+          <w:b w:val="0"/>
           <w:sz w:val="24"/>
         </w:rPr>
         <w:t>核心业务实体选择“报修工单”。工单状态从待提交开始，经待审核、待派工、维修中、待确认，最终进入已完成状态。异常状态包括已驳回、已取消和返修。</w:t>
@@ -430,7 +633,7 @@
                     <pic:cNvPicPr/>
                   </pic:nvPicPr>
                   <pic:blipFill>
-                    <a:blip r:embed="rId12"/>
+                    <a:blip r:embed="rId13"/>
                     <a:stretch>
                       <a:fillRect/>
                     </a:stretch>
@@ -477,6 +680,7 @@
       <w:r>
         <w:rPr>
           <w:rFonts w:ascii="宋体" w:hAnsi="宋体" w:eastAsia="宋体"/>
+          <w:b w:val="0"/>
           <w:sz w:val="24"/>
         </w:rPr>
         <w:t>根据需求分析阶段的 0 层 DFD，系统可以采用事务型数据流设计方法转换为层次化功能结构。报修申请、工单审核、派工处理、维修反馈、统计查询分别对应 0 层 DFD 中的 P1 至 P5 加工。系统顶层模块负责协调各功能模块，数据存储访问通过统一接口完成，从而保证工单状态、派工记录和统计数据的一致性。</w:t>
@@ -490,6 +694,7 @@
       <w:r>
         <w:rPr>
           <w:rFonts w:ascii="宋体" w:hAnsi="宋体" w:eastAsia="宋体"/>
+          <w:b w:val="0"/>
           <w:sz w:val="24"/>
         </w:rPr>
         <w:t>模块接口设计如下：报修申请模块输出待审核工单；工单审核模块读取工单和学生宿舍档案，输出有效工单或驳回结果；派工处理模块读取有效工单和维修员信息，输出派工记录；维修反馈模块更新维修记录和工单状态；统计查询模块读取工单库与维修记录，生成统计报表。</w:t>
@@ -515,7 +720,7 @@
                     <pic:cNvPicPr/>
                   </pic:nvPicPr>
                   <pic:blipFill>
-                    <a:blip r:embed="rId13"/>
+                    <a:blip r:embed="rId14"/>
                     <a:stretch>
                       <a:fillRect/>
                     </a:stretch>
@@ -562,6 +767,7 @@
       <w:r>
         <w:rPr>
           <w:rFonts w:ascii="宋体" w:hAnsi="宋体" w:eastAsia="宋体"/>
+          <w:b w:val="0"/>
           <w:sz w:val="24"/>
         </w:rPr>
         <w:t>详细设计选择两个包含分支与循环逻辑的模块。第一个模块为“报修申请受理模块”，使用程序流程图描述。该模块需要判断学生填写的信息是否完整、学生宿舍档案是否匹配，并循环检查附件格式和数量，最后根据故障类型设置紧急程度并生成工单。</w:t>
@@ -575,6 +781,7 @@
       <w:r>
         <w:rPr>
           <w:rFonts w:ascii="宋体" w:hAnsi="宋体" w:eastAsia="宋体"/>
+          <w:b w:val="0"/>
           <w:sz w:val="24"/>
         </w:rPr>
         <w:t>第二个模块为“派工处理模块”，使用 N-S 图描述。该模块先读取待派工工单并按紧急程度排序，然后对每一张工单循环处理；在循环体内根据故障类型筛选维修员，如果没有可派维修员，则工单进入待协调状态，否则选择当前负载最低的维修员并生成派工单。</w:t>
@@ -600,7 +807,7 @@
                     <pic:cNvPicPr/>
                   </pic:nvPicPr>
                   <pic:blipFill>
-                    <a:blip r:embed="rId14"/>
+                    <a:blip r:embed="rId15"/>
                     <a:stretch>
                       <a:fillRect/>
                     </a:stretch>
@@ -651,7 +858,7 @@
                     <pic:cNvPicPr/>
                   </pic:nvPicPr>
                   <pic:blipFill>
-                    <a:blip r:embed="rId15"/>
+                    <a:blip r:embed="rId16"/>
                     <a:stretch>
                       <a:fillRect/>
                     </a:stretch>
@@ -698,6 +905,7 @@
       <w:r>
         <w:rPr>
           <w:rFonts w:ascii="宋体" w:hAnsi="宋体" w:eastAsia="宋体"/>
+          <w:b w:val="0"/>
           <w:sz w:val="24"/>
         </w:rPr>
         <w:t>本节选择“报修申请受理模块”编写 PDL 伪代码。伪代码与第三部分程序流程图保持一致，包含输入校验、宿舍档案匹配、附件循环检查、紧急程度判断、工单生成和通知管理员等步骤。</w:t>
@@ -1143,6 +1351,7 @@
       <w:r>
         <w:rPr>
           <w:rFonts w:ascii="宋体" w:hAnsi="宋体" w:eastAsia="宋体"/>
+          <w:b w:val="0"/>
           <w:sz w:val="24"/>
         </w:rPr>
         <w:t>测试对象选择“报修申请受理模块”。该模块包含嵌套分支和附件循环检查，适合同时进行白盒测试与黑盒测试。白盒测试依据 PDL 伪代码设计，重点覆盖语句覆盖、判定-条件覆盖、条件组合覆盖和独立路径覆盖；黑盒测试从用户输入角度进行等价类划分与边界值分析。</w:t>
@@ -1156,6 +1365,7 @@
       <w:r>
         <w:rPr>
           <w:rFonts w:ascii="宋体" w:hAnsi="宋体" w:eastAsia="宋体"/>
+          <w:b w:val="0"/>
           <w:sz w:val="24"/>
         </w:rPr>
         <w:t>用例图覆盖系统主要参与者与核心用例，可直接作为系统测试和验收测试的功能依据。</w:t>
@@ -1177,6 +1387,7 @@
       <w:r>
         <w:rPr>
           <w:rFonts w:ascii="宋体" w:hAnsi="宋体" w:eastAsia="宋体"/>
+          <w:b w:val="0"/>
           <w:sz w:val="24"/>
         </w:rPr>
         <w:t>白盒测试以报修申请受理模块的 PDL 伪代码为依据。该模块的关键判定包括必填信息是否完整、学生宿舍档案是否匹配、附件是否合法、附件数量是否超限以及故障类型是否紧急。</w:t>
@@ -1190,15 +1401,15 @@
         <w:tblLook w:firstColumn="1" w:firstRow="1" w:lastColumn="0" w:lastRow="0" w:noHBand="0" w:noVBand="1" w:val="04A0"/>
       </w:tblPr>
       <w:tblGrid>
-        <w:gridCol w:w="2295"/>
-        <w:gridCol w:w="2295"/>
-        <w:gridCol w:w="2295"/>
-        <w:gridCol w:w="2295"/>
+        <w:gridCol w:w="2323"/>
+        <w:gridCol w:w="2323"/>
+        <w:gridCol w:w="2323"/>
+        <w:gridCol w:w="2323"/>
       </w:tblGrid>
       <w:tr>
         <w:tc>
           <w:tcPr>
-            <w:tcW w:type="dxa" w:w="2295"/>
+            <w:tcW w:type="dxa" w:w="2323"/>
             <w:vAlign w:val="center"/>
             <w:shd w:fill="D9EAF7"/>
           </w:tcPr>
@@ -1219,7 +1430,7 @@
         </w:tc>
         <w:tc>
           <w:tcPr>
-            <w:tcW w:type="dxa" w:w="2295"/>
+            <w:tcW w:type="dxa" w:w="2323"/>
             <w:vAlign w:val="center"/>
             <w:shd w:fill="D9EAF7"/>
           </w:tcPr>
@@ -1240,7 +1451,7 @@
         </w:tc>
         <w:tc>
           <w:tcPr>
-            <w:tcW w:type="dxa" w:w="2295"/>
+            <w:tcW w:type="dxa" w:w="2323"/>
             <w:vAlign w:val="center"/>
             <w:shd w:fill="D9EAF7"/>
           </w:tcPr>
@@ -1261,7 +1472,7 @@
         </w:tc>
         <w:tc>
           <w:tcPr>
-            <w:tcW w:type="dxa" w:w="2295"/>
+            <w:tcW w:type="dxa" w:w="2323"/>
             <w:vAlign w:val="center"/>
             <w:shd w:fill="D9EAF7"/>
           </w:tcPr>
@@ -1284,7 +1495,7 @@
       <w:tr>
         <w:tc>
           <w:tcPr>
-            <w:tcW w:type="dxa" w:w="2295"/>
+            <w:tcW w:type="dxa" w:w="2323"/>
             <w:vAlign w:val="center"/>
           </w:tcPr>
           <w:p>
@@ -1304,7 +1515,7 @@
         </w:tc>
         <w:tc>
           <w:tcPr>
-            <w:tcW w:type="dxa" w:w="2295"/>
+            <w:tcW w:type="dxa" w:w="2323"/>
             <w:vAlign w:val="center"/>
           </w:tcPr>
           <w:p>
@@ -1324,7 +1535,7 @@
         </w:tc>
         <w:tc>
           <w:tcPr>
-            <w:tcW w:type="dxa" w:w="2295"/>
+            <w:tcW w:type="dxa" w:w="2323"/>
             <w:vAlign w:val="center"/>
           </w:tcPr>
           <w:p>
@@ -1344,7 +1555,7 @@
         </w:tc>
         <w:tc>
           <w:tcPr>
-            <w:tcW w:type="dxa" w:w="2295"/>
+            <w:tcW w:type="dxa" w:w="2323"/>
             <w:vAlign w:val="center"/>
           </w:tcPr>
           <w:p>
@@ -1366,7 +1577,7 @@
       <w:tr>
         <w:tc>
           <w:tcPr>
-            <w:tcW w:type="dxa" w:w="2295"/>
+            <w:tcW w:type="dxa" w:w="2323"/>
             <w:vAlign w:val="center"/>
           </w:tcPr>
           <w:p>
@@ -1386,7 +1597,7 @@
         </w:tc>
         <w:tc>
           <w:tcPr>
-            <w:tcW w:type="dxa" w:w="2295"/>
+            <w:tcW w:type="dxa" w:w="2323"/>
             <w:vAlign w:val="center"/>
           </w:tcPr>
           <w:p>
@@ -1406,7 +1617,7 @@
         </w:tc>
         <w:tc>
           <w:tcPr>
-            <w:tcW w:type="dxa" w:w="2295"/>
+            <w:tcW w:type="dxa" w:w="2323"/>
             <w:vAlign w:val="center"/>
           </w:tcPr>
           <w:p>
@@ -1426,7 +1637,7 @@
         </w:tc>
         <w:tc>
           <w:tcPr>
-            <w:tcW w:type="dxa" w:w="2295"/>
+            <w:tcW w:type="dxa" w:w="2323"/>
             <w:vAlign w:val="center"/>
           </w:tcPr>
           <w:p>
@@ -1448,7 +1659,7 @@
       <w:tr>
         <w:tc>
           <w:tcPr>
-            <w:tcW w:type="dxa" w:w="2295"/>
+            <w:tcW w:type="dxa" w:w="2323"/>
             <w:vAlign w:val="center"/>
           </w:tcPr>
           <w:p>
@@ -1468,7 +1679,7 @@
         </w:tc>
         <w:tc>
           <w:tcPr>
-            <w:tcW w:type="dxa" w:w="2295"/>
+            <w:tcW w:type="dxa" w:w="2323"/>
             <w:vAlign w:val="center"/>
           </w:tcPr>
           <w:p>
@@ -1488,7 +1699,7 @@
         </w:tc>
         <w:tc>
           <w:tcPr>
-            <w:tcW w:type="dxa" w:w="2295"/>
+            <w:tcW w:type="dxa" w:w="2323"/>
             <w:vAlign w:val="center"/>
           </w:tcPr>
           <w:p>
@@ -1508,7 +1719,7 @@
         </w:tc>
         <w:tc>
           <w:tcPr>
-            <w:tcW w:type="dxa" w:w="2295"/>
+            <w:tcW w:type="dxa" w:w="2323"/>
             <w:vAlign w:val="center"/>
           </w:tcPr>
           <w:p>
@@ -1530,7 +1741,7 @@
       <w:tr>
         <w:tc>
           <w:tcPr>
-            <w:tcW w:type="dxa" w:w="2295"/>
+            <w:tcW w:type="dxa" w:w="2323"/>
             <w:vAlign w:val="center"/>
           </w:tcPr>
           <w:p>
@@ -1550,7 +1761,7 @@
         </w:tc>
         <w:tc>
           <w:tcPr>
-            <w:tcW w:type="dxa" w:w="2295"/>
+            <w:tcW w:type="dxa" w:w="2323"/>
             <w:vAlign w:val="center"/>
           </w:tcPr>
           <w:p>
@@ -1570,7 +1781,7 @@
         </w:tc>
         <w:tc>
           <w:tcPr>
-            <w:tcW w:type="dxa" w:w="2295"/>
+            <w:tcW w:type="dxa" w:w="2323"/>
             <w:vAlign w:val="center"/>
           </w:tcPr>
           <w:p>
@@ -1590,7 +1801,7 @@
         </w:tc>
         <w:tc>
           <w:tcPr>
-            <w:tcW w:type="dxa" w:w="2295"/>
+            <w:tcW w:type="dxa" w:w="2323"/>
             <w:vAlign w:val="center"/>
           </w:tcPr>
           <w:p>
@@ -1626,6 +1837,7 @@
       <w:r>
         <w:rPr>
           <w:rFonts w:ascii="宋体" w:hAnsi="宋体" w:eastAsia="宋体"/>
+          <w:b w:val="0"/>
           <w:sz w:val="24"/>
         </w:rPr>
         <w:t>黑盒测试从输入域出发，不依赖程序内部结构。等价类划分如下表所示。</w:t>
@@ -1639,15 +1851,15 @@
         <w:tblLook w:firstColumn="1" w:firstRow="1" w:lastColumn="0" w:lastRow="0" w:noHBand="0" w:noVBand="1" w:val="04A0"/>
       </w:tblPr>
       <w:tblGrid>
-        <w:gridCol w:w="2295"/>
-        <w:gridCol w:w="2295"/>
-        <w:gridCol w:w="2295"/>
-        <w:gridCol w:w="2295"/>
+        <w:gridCol w:w="2323"/>
+        <w:gridCol w:w="2323"/>
+        <w:gridCol w:w="2323"/>
+        <w:gridCol w:w="2323"/>
       </w:tblGrid>
       <w:tr>
         <w:tc>
           <w:tcPr>
-            <w:tcW w:type="dxa" w:w="2295"/>
+            <w:tcW w:type="dxa" w:w="2323"/>
             <w:vAlign w:val="center"/>
             <w:shd w:fill="D9EAF7"/>
           </w:tcPr>
@@ -1668,7 +1880,7 @@
         </w:tc>
         <w:tc>
           <w:tcPr>
-            <w:tcW w:type="dxa" w:w="2295"/>
+            <w:tcW w:type="dxa" w:w="2323"/>
             <w:vAlign w:val="center"/>
             <w:shd w:fill="D9EAF7"/>
           </w:tcPr>
@@ -1689,7 +1901,7 @@
         </w:tc>
         <w:tc>
           <w:tcPr>
-            <w:tcW w:type="dxa" w:w="2295"/>
+            <w:tcW w:type="dxa" w:w="2323"/>
             <w:vAlign w:val="center"/>
             <w:shd w:fill="D9EAF7"/>
           </w:tcPr>
@@ -1710,7 +1922,7 @@
         </w:tc>
         <w:tc>
           <w:tcPr>
-            <w:tcW w:type="dxa" w:w="2295"/>
+            <w:tcW w:type="dxa" w:w="2323"/>
             <w:vAlign w:val="center"/>
             <w:shd w:fill="D9EAF7"/>
           </w:tcPr>
@@ -1733,7 +1945,7 @@
       <w:tr>
         <w:tc>
           <w:tcPr>
-            <w:tcW w:type="dxa" w:w="2295"/>
+            <w:tcW w:type="dxa" w:w="2323"/>
             <w:vAlign w:val="center"/>
           </w:tcPr>
           <w:p>
@@ -1753,7 +1965,7 @@
         </w:tc>
         <w:tc>
           <w:tcPr>
-            <w:tcW w:type="dxa" w:w="2295"/>
+            <w:tcW w:type="dxa" w:w="2323"/>
             <w:vAlign w:val="center"/>
           </w:tcPr>
           <w:p>
@@ -1773,7 +1985,7 @@
         </w:tc>
         <w:tc>
           <w:tcPr>
-            <w:tcW w:type="dxa" w:w="2295"/>
+            <w:tcW w:type="dxa" w:w="2323"/>
             <w:vAlign w:val="center"/>
           </w:tcPr>
           <w:p>
@@ -1793,7 +2005,7 @@
         </w:tc>
         <w:tc>
           <w:tcPr>
-            <w:tcW w:type="dxa" w:w="2295"/>
+            <w:tcW w:type="dxa" w:w="2323"/>
             <w:vAlign w:val="center"/>
           </w:tcPr>
           <w:p>
@@ -1815,7 +2027,7 @@
       <w:tr>
         <w:tc>
           <w:tcPr>
-            <w:tcW w:type="dxa" w:w="2295"/>
+            <w:tcW w:type="dxa" w:w="2323"/>
             <w:vAlign w:val="center"/>
           </w:tcPr>
           <w:p>
@@ -1835,7 +2047,7 @@
         </w:tc>
         <w:tc>
           <w:tcPr>
-            <w:tcW w:type="dxa" w:w="2295"/>
+            <w:tcW w:type="dxa" w:w="2323"/>
             <w:vAlign w:val="center"/>
           </w:tcPr>
           <w:p>
@@ -1855,7 +2067,7 @@
         </w:tc>
         <w:tc>
           <w:tcPr>
-            <w:tcW w:type="dxa" w:w="2295"/>
+            <w:tcW w:type="dxa" w:w="2323"/>
             <w:vAlign w:val="center"/>
           </w:tcPr>
           <w:p>
@@ -1875,7 +2087,7 @@
         </w:tc>
         <w:tc>
           <w:tcPr>
-            <w:tcW w:type="dxa" w:w="2295"/>
+            <w:tcW w:type="dxa" w:w="2323"/>
             <w:vAlign w:val="center"/>
           </w:tcPr>
           <w:p>
@@ -1897,7 +2109,7 @@
       <w:tr>
         <w:tc>
           <w:tcPr>
-            <w:tcW w:type="dxa" w:w="2295"/>
+            <w:tcW w:type="dxa" w:w="2323"/>
             <w:vAlign w:val="center"/>
           </w:tcPr>
           <w:p>
@@ -1917,7 +2129,7 @@
         </w:tc>
         <w:tc>
           <w:tcPr>
-            <w:tcW w:type="dxa" w:w="2295"/>
+            <w:tcW w:type="dxa" w:w="2323"/>
             <w:vAlign w:val="center"/>
           </w:tcPr>
           <w:p>
@@ -1937,7 +2149,7 @@
         </w:tc>
         <w:tc>
           <w:tcPr>
-            <w:tcW w:type="dxa" w:w="2295"/>
+            <w:tcW w:type="dxa" w:w="2323"/>
             <w:vAlign w:val="center"/>
           </w:tcPr>
           <w:p>
@@ -1957,7 +2169,7 @@
         </w:tc>
         <w:tc>
           <w:tcPr>
-            <w:tcW w:type="dxa" w:w="2295"/>
+            <w:tcW w:type="dxa" w:w="2323"/>
             <w:vAlign w:val="center"/>
           </w:tcPr>
           <w:p>
@@ -1979,7 +2191,7 @@
       <w:tr>
         <w:tc>
           <w:tcPr>
-            <w:tcW w:type="dxa" w:w="2295"/>
+            <w:tcW w:type="dxa" w:w="2323"/>
             <w:vAlign w:val="center"/>
           </w:tcPr>
           <w:p>
@@ -1999,7 +2211,7 @@
         </w:tc>
         <w:tc>
           <w:tcPr>
-            <w:tcW w:type="dxa" w:w="2295"/>
+            <w:tcW w:type="dxa" w:w="2323"/>
             <w:vAlign w:val="center"/>
           </w:tcPr>
           <w:p>
@@ -2019,7 +2231,7 @@
         </w:tc>
         <w:tc>
           <w:tcPr>
-            <w:tcW w:type="dxa" w:w="2295"/>
+            <w:tcW w:type="dxa" w:w="2323"/>
             <w:vAlign w:val="center"/>
           </w:tcPr>
           <w:p>
@@ -2039,7 +2251,7 @@
         </w:tc>
         <w:tc>
           <w:tcPr>
-            <w:tcW w:type="dxa" w:w="2295"/>
+            <w:tcW w:type="dxa" w:w="2323"/>
             <w:vAlign w:val="center"/>
           </w:tcPr>
           <w:p>
@@ -2061,7 +2273,7 @@
       <w:tr>
         <w:tc>
           <w:tcPr>
-            <w:tcW w:type="dxa" w:w="2295"/>
+            <w:tcW w:type="dxa" w:w="2323"/>
             <w:vAlign w:val="center"/>
           </w:tcPr>
           <w:p>
@@ -2081,7 +2293,7 @@
         </w:tc>
         <w:tc>
           <w:tcPr>
-            <w:tcW w:type="dxa" w:w="2295"/>
+            <w:tcW w:type="dxa" w:w="2323"/>
             <w:vAlign w:val="center"/>
           </w:tcPr>
           <w:p>
@@ -2101,7 +2313,7 @@
         </w:tc>
         <w:tc>
           <w:tcPr>
-            <w:tcW w:type="dxa" w:w="2295"/>
+            <w:tcW w:type="dxa" w:w="2323"/>
             <w:vAlign w:val="center"/>
           </w:tcPr>
           <w:p>
@@ -2121,7 +2333,7 @@
         </w:tc>
         <w:tc>
           <w:tcPr>
-            <w:tcW w:type="dxa" w:w="2295"/>
+            <w:tcW w:type="dxa" w:w="2323"/>
             <w:vAlign w:val="center"/>
           </w:tcPr>
           <w:p>
@@ -2149,6 +2361,7 @@
       <w:r>
         <w:rPr>
           <w:rFonts w:ascii="宋体" w:hAnsi="宋体" w:eastAsia="宋体"/>
+          <w:b w:val="0"/>
           <w:sz w:val="24"/>
         </w:rPr>
         <w:t>边界值分析包括一般性测试和健壮性测试，如下表所示。</w:t>
@@ -2162,15 +2375,15 @@
         <w:tblLook w:firstColumn="1" w:firstRow="1" w:lastColumn="0" w:lastRow="0" w:noHBand="0" w:noVBand="1" w:val="04A0"/>
       </w:tblPr>
       <w:tblGrid>
-        <w:gridCol w:w="2295"/>
-        <w:gridCol w:w="2295"/>
-        <w:gridCol w:w="2295"/>
-        <w:gridCol w:w="2295"/>
+        <w:gridCol w:w="2323"/>
+        <w:gridCol w:w="2323"/>
+        <w:gridCol w:w="2323"/>
+        <w:gridCol w:w="2323"/>
       </w:tblGrid>
       <w:tr>
         <w:tc>
           <w:tcPr>
-            <w:tcW w:type="dxa" w:w="2295"/>
+            <w:tcW w:type="dxa" w:w="2323"/>
             <w:vAlign w:val="center"/>
             <w:shd w:fill="D9EAF7"/>
           </w:tcPr>
@@ -2191,7 +2404,7 @@
         </w:tc>
         <w:tc>
           <w:tcPr>
-            <w:tcW w:type="dxa" w:w="2295"/>
+            <w:tcW w:type="dxa" w:w="2323"/>
             <w:vAlign w:val="center"/>
             <w:shd w:fill="D9EAF7"/>
           </w:tcPr>
@@ -2212,7 +2425,7 @@
         </w:tc>
         <w:tc>
           <w:tcPr>
-            <w:tcW w:type="dxa" w:w="2295"/>
+            <w:tcW w:type="dxa" w:w="2323"/>
             <w:vAlign w:val="center"/>
             <w:shd w:fill="D9EAF7"/>
           </w:tcPr>
@@ -2233,7 +2446,7 @@
         </w:tc>
         <w:tc>
           <w:tcPr>
-            <w:tcW w:type="dxa" w:w="2295"/>
+            <w:tcW w:type="dxa" w:w="2323"/>
             <w:vAlign w:val="center"/>
             <w:shd w:fill="D9EAF7"/>
           </w:tcPr>
@@ -2256,7 +2469,7 @@
       <w:tr>
         <w:tc>
           <w:tcPr>
-            <w:tcW w:type="dxa" w:w="2295"/>
+            <w:tcW w:type="dxa" w:w="2323"/>
             <w:vAlign w:val="center"/>
           </w:tcPr>
           <w:p>
@@ -2276,7 +2489,7 @@
         </w:tc>
         <w:tc>
           <w:tcPr>
-            <w:tcW w:type="dxa" w:w="2295"/>
+            <w:tcW w:type="dxa" w:w="2323"/>
             <w:vAlign w:val="center"/>
           </w:tcPr>
           <w:p>
@@ -2296,7 +2509,7 @@
         </w:tc>
         <w:tc>
           <w:tcPr>
-            <w:tcW w:type="dxa" w:w="2295"/>
+            <w:tcW w:type="dxa" w:w="2323"/>
             <w:vAlign w:val="center"/>
           </w:tcPr>
           <w:p>
@@ -2316,7 +2529,7 @@
         </w:tc>
         <w:tc>
           <w:tcPr>
-            <w:tcW w:type="dxa" w:w="2295"/>
+            <w:tcW w:type="dxa" w:w="2323"/>
             <w:vAlign w:val="center"/>
           </w:tcPr>
           <w:p>
@@ -2338,7 +2551,7 @@
       <w:tr>
         <w:tc>
           <w:tcPr>
-            <w:tcW w:type="dxa" w:w="2295"/>
+            <w:tcW w:type="dxa" w:w="2323"/>
             <w:vAlign w:val="center"/>
           </w:tcPr>
           <w:p>
@@ -2358,7 +2571,7 @@
         </w:tc>
         <w:tc>
           <w:tcPr>
-            <w:tcW w:type="dxa" w:w="2295"/>
+            <w:tcW w:type="dxa" w:w="2323"/>
             <w:vAlign w:val="center"/>
           </w:tcPr>
           <w:p>
@@ -2378,7 +2591,7 @@
         </w:tc>
         <w:tc>
           <w:tcPr>
-            <w:tcW w:type="dxa" w:w="2295"/>
+            <w:tcW w:type="dxa" w:w="2323"/>
             <w:vAlign w:val="center"/>
           </w:tcPr>
           <w:p>
@@ -2398,7 +2611,7 @@
         </w:tc>
         <w:tc>
           <w:tcPr>
-            <w:tcW w:type="dxa" w:w="2295"/>
+            <w:tcW w:type="dxa" w:w="2323"/>
             <w:vAlign w:val="center"/>
           </w:tcPr>
           <w:p>
@@ -2420,7 +2633,7 @@
       <w:tr>
         <w:tc>
           <w:tcPr>
-            <w:tcW w:type="dxa" w:w="2295"/>
+            <w:tcW w:type="dxa" w:w="2323"/>
             <w:vAlign w:val="center"/>
           </w:tcPr>
           <w:p>
@@ -2440,7 +2653,7 @@
         </w:tc>
         <w:tc>
           <w:tcPr>
-            <w:tcW w:type="dxa" w:w="2295"/>
+            <w:tcW w:type="dxa" w:w="2323"/>
             <w:vAlign w:val="center"/>
           </w:tcPr>
           <w:p>
@@ -2460,7 +2673,7 @@
         </w:tc>
         <w:tc>
           <w:tcPr>
-            <w:tcW w:type="dxa" w:w="2295"/>
+            <w:tcW w:type="dxa" w:w="2323"/>
             <w:vAlign w:val="center"/>
           </w:tcPr>
           <w:p>
@@ -2480,7 +2693,7 @@
         </w:tc>
         <w:tc>
           <w:tcPr>
-            <w:tcW w:type="dxa" w:w="2295"/>
+            <w:tcW w:type="dxa" w:w="2323"/>
             <w:vAlign w:val="center"/>
           </w:tcPr>
           <w:p>
@@ -2502,7 +2715,7 @@
       <w:tr>
         <w:tc>
           <w:tcPr>
-            <w:tcW w:type="dxa" w:w="2295"/>
+            <w:tcW w:type="dxa" w:w="2323"/>
             <w:vAlign w:val="center"/>
           </w:tcPr>
           <w:p>
@@ -2522,7 +2735,7 @@
         </w:tc>
         <w:tc>
           <w:tcPr>
-            <w:tcW w:type="dxa" w:w="2295"/>
+            <w:tcW w:type="dxa" w:w="2323"/>
             <w:vAlign w:val="center"/>
           </w:tcPr>
           <w:p>
@@ -2542,7 +2755,7 @@
         </w:tc>
         <w:tc>
           <w:tcPr>
-            <w:tcW w:type="dxa" w:w="2295"/>
+            <w:tcW w:type="dxa" w:w="2323"/>
             <w:vAlign w:val="center"/>
           </w:tcPr>
           <w:p>
@@ -2562,7 +2775,7 @@
         </w:tc>
         <w:tc>
           <w:tcPr>
-            <w:tcW w:type="dxa" w:w="2295"/>
+            <w:tcW w:type="dxa" w:w="2323"/>
             <w:vAlign w:val="center"/>
           </w:tcPr>
           <w:p>
@@ -2598,6 +2811,7 @@
       <w:r>
         <w:rPr>
           <w:rFonts w:ascii="宋体" w:hAnsi="宋体" w:eastAsia="宋体"/>
+          <w:b w:val="0"/>
           <w:sz w:val="24"/>
         </w:rPr>
         <w:t>系统用例图包含学生、管理员、维修员、后勤部门四类参与者，覆盖报修、查询、审核、派工、维修反馈、统计导出等核心用例。</w:t>
@@ -2623,7 +2837,7 @@
                     <pic:cNvPicPr/>
                   </pic:nvPicPr>
                   <pic:blipFill>
-                    <a:blip r:embed="rId16"/>
+                    <a:blip r:embed="rId17"/>
                     <a:stretch>
                       <a:fillRect/>
                     </a:stretch>
@@ -2670,19 +2884,95 @@
       <w:r>
         <w:rPr>
           <w:rFonts w:ascii="宋体" w:hAnsi="宋体" w:eastAsia="宋体"/>
+          <w:b w:val="0"/>
           <w:sz w:val="24"/>
         </w:rPr>
         <w:t>宿舍报修管理系统围绕报修工单形成完整业务闭环。需求分析中的类图、DFD 和状态图明确了系统对象、数据流和状态变化；总体设计将 0 层 DFD 转换为层次化功能结构；详细设计、PDL 伪代码和测试用例均围绕报修申请受理与派工处理展开，保证了前后设计内容的一致性。系统能够满足学生便捷报修、管理员规范派工、维修员及时反馈和后勤部门统计管理的基本需求。</w:t>
       </w:r>
     </w:p>
+    <w:p>
+      <w:pPr>
+        <w:spacing w:before="160" w:after="80"/>
+      </w:pPr>
+      <w:r>
+        <w:rPr>
+          <w:rFonts w:ascii="黑体" w:hAnsi="黑体" w:eastAsia="黑体"/>
+          <w:b/>
+          <w:sz w:val="28"/>
+        </w:rPr>
+        <w:t>个人总结：</w:t>
+      </w:r>
+    </w:p>
+    <w:p>
+      <w:pPr>
+        <w:spacing w:line="360" w:lineRule="auto"/>
+        <w:ind w:firstLine="420"/>
+      </w:pPr>
+      <w:r>
+        <w:rPr>
+          <w:rFonts w:ascii="宋体" w:hAnsi="宋体" w:eastAsia="宋体"/>
+          <w:b w:val="0"/>
+          <w:sz w:val="24"/>
+        </w:rPr>
+        <w:t>通过本次宿舍报修管理系统的分析与设计，我进一步理解了软件工程各阶段之间的衔接关系。需求分析阶段明确系统边界和数据流，总体设计阶段完成模块划分，详细设计阶段细化关键模块逻辑，编码与测试阶段则验证设计是否可实现、是否前后一致。本次设计也让我认识到，图形规范、数据命名和测试用例之间必须保持一致，否则容易出现设计与实现脱节的问题。</w:t>
+      </w:r>
+    </w:p>
+    <w:p/>
+    <w:p>
+      <w:pPr>
+        <w:spacing w:line="360" w:lineRule="auto"/>
+      </w:pPr>
+      <w:r>
+        <w:rPr>
+          <w:rFonts w:ascii="宋体" w:hAnsi="宋体" w:eastAsia="宋体"/>
+          <w:b w:val="0"/>
+          <w:sz w:val="24"/>
+        </w:rPr>
+        <w:t>学生签名：____________________</w:t>
+      </w:r>
+    </w:p>
+    <w:p>
+      <w:pPr>
+        <w:spacing w:line="360" w:lineRule="auto"/>
+      </w:pPr>
+      <w:r>
+        <w:rPr>
+          <w:rFonts w:ascii="宋体" w:hAnsi="宋体" w:eastAsia="宋体"/>
+          <w:b w:val="0"/>
+          <w:sz w:val="24"/>
+        </w:rPr>
+        <w:t>指导教师签字（签章）：____________________</w:t>
+      </w:r>
+    </w:p>
     <w:sectPr>
+      <w:footerReference w:type="default" r:id="rId9"/>
       <w:pgSz w:w="12240" w:h="15840"/>
-      <w:pgMar w:top="1417" w:right="1474" w:bottom="1417" w:left="1587" w:header="720" w:footer="720" w:gutter="0"/>
+      <w:pgMar w:top="1389" w:right="1417" w:bottom="1247" w:left="1531" w:header="720" w:footer="720" w:gutter="0"/>
       <w:cols w:space="720"/>
       <w:docGrid w:linePitch="360"/>
     </w:sectPr>
   </w:body>
 </w:document>
+</file>
+
+<file path=word/footer1.xml><?xml version="1.0" encoding="utf-8"?>
+<w:ftr xmlns:m="http://schemas.openxmlformats.org/officeDocument/2006/math" xmlns:mc="http://schemas.openxmlformats.org/markup-compatibility/2006" xmlns:mo="http://schemas.microsoft.com/office/mac/office/2008/main" xmlns:mv="urn:schemas-microsoft-com:mac:vml" xmlns:o="urn:schemas-microsoft-com:office:office" xmlns:r="http://schemas.openxmlformats.org/officeDocument/2006/relationships" xmlns:v="urn:schemas-microsoft-com:vml" xmlns:w10="urn:schemas-microsoft-com:office:word" xmlns:w14="http://schemas.microsoft.com/office/word/2010/wordml" xmlns:w="http://schemas.openxmlformats.org/wordprocessingml/2006/main" xmlns:wne="http://schemas.microsoft.com/office/word/2006/wordml" xmlns:wp14="http://schemas.microsoft.com/office/word/2010/wordprocessingDrawing" xmlns:wp="http://schemas.openxmlformats.org/drawingml/2006/wordprocessingDrawing" xmlns:wpc="http://schemas.microsoft.com/office/word/2010/wordprocessingCanvas" xmlns:wpg="http://schemas.microsoft.com/office/word/2010/wordprocessingGroup" xmlns:wpi="http://schemas.microsoft.com/office/word/2010/wordprocessingInk" xmlns:wps="http://schemas.microsoft.com/office/word/2010/wordprocessingShape" mc:Ignorable="w14 wp14">
+  <w:p>
+    <w:pPr>
+      <w:pStyle w:val="Footer"/>
+      <w:jc w:val="center"/>
+    </w:pPr>
+    <w:r>
+      <w:t xml:space="preserve">- </w:t>
+    </w:r>
+    <w:fldChar w:fldCharType="begin"/>
+    <w:instrText xml:space="preserve">PAGE</w:instrText>
+    <w:fldChar w:fldCharType="end"/>
+    <w:r>
+      <w:t xml:space="preserve"> -</w:t>
+    </w:r>
+  </w:p>
+</w:ftr>
 </file>
 
 <file path=word/numbering.xml><?xml version="1.0" encoding="utf-8"?>
@@ -3048,6 +3338,9 @@
     <w:name w:val="Normal"/>
     <w:qFormat/>
     <w:rsid w:val="00FC693F"/>
+    <w:pPr>
+      <w:spacing w:line="360" w:lineRule="auto"/>
+    </w:pPr>
     <w:rPr>
       <w:rFonts w:ascii="宋体" w:hAnsi="宋体" w:eastAsia="宋体"/>
       <w:sz w:val="24"/>

</xml_diff>